<commit_message>
Refresh native showcase evidence and classify delivery examples
</commit_message>
<xml_diff>
--- a/Website/static/downloads/showcase/features/word-comparison/comparisonreportworkflow.redline.docx
+++ b/Website/static/downloads/showcase/features/word-comparison/comparisonreportworkflow.redline.docx
@@ -906,7 +906,7 @@
           <w:p>
             <w:pPr/>
             <w:r>
-              <w:t xml:space="preserve">comment id=1; author=Legal Reviewer; initials=LR; date=2026-09-07T11:40:02.8756136Z; resolved=unknown; target=Review target; text=Confirm this wording before approval.</w:t>
+              <w:t xml:space="preserve">comment id=1; author=Legal Reviewer; initials=LR; date=2026-10-12T02:32:32.6658101Z; resolved=unknown; target=Review target; text=Confirm this wording before approval.</w:t>
             </w:r>
           </w:p>
         </w:tc>
@@ -917,7 +917,7 @@
           <w:p>
             <w:pPr/>
             <w:r>
-              <w:t xml:space="preserve">comment id=1; author=Legal Reviewer; initials=LR; date=2026-09-07T11:40:02.9057743Z; resolved=unknown; target=Review target; text=Approved for the premium contract.</w:t>
+              <w:t xml:space="preserve">comment id=1; author=Legal Reviewer; initials=LR; date=2026-10-12T02:32:32.6776920Z; resolved=unknown; target=Review target; text=Approved for the premium contract.</w:t>
             </w:r>
           </w:p>
         </w:tc>

</xml_diff>